<commit_message>
GDD şablonunu slaytlarla eşle, oyun oynamayı ev ödevine taşı
Co-Authored-By: Claude Opus 5.5 <noreply@anthropic.com>
</commit_message>
<xml_diff>
--- a/GDD-Sablonu.docx
+++ b/GDD-Sablonu.docx
@@ -53,6 +53,25 @@
     </w:p>
     <w:p>
       <w:pPr>
+        <w:spacing w:after="80"/>
+      </w:pPr>
+      <w:r>
+        <w:rPr>
+          <w:b/>
+          <w:bCs/>
+          <w:color w:val="17181C"/>
+        </w:rPr>
+        <w:t xml:space="preserve">Ekip Üyeleri ve Rolleri: </w:t>
+      </w:r>
+      <w:r>
+        <w:rPr>
+          <w:color w:val="444444"/>
+        </w:rPr>
+        <w:t xml:space="preserve">_________________________________</w:t>
+      </w:r>
+    </w:p>
+    <w:p>
+      <w:pPr>
         <w:pBdr>
           <w:bottom w:val="single" w:color="17181C" w:sz="6" w:space="8"/>
         </w:pBdr>
@@ -71,6 +90,21 @@
           <w:color w:val="444444"/>
         </w:rPr>
         <w:t xml:space="preserve">_______________________________________________</w:t>
+      </w:r>
+    </w:p>
+    <w:p>
+      <w:pPr>
+        <w:spacing w:before="160" w:after="60"/>
+      </w:pPr>
+      <w:r>
+        <w:rPr>
+          <w:i/>
+          <w:iCs/>
+          <w:color w:val="6B6B6B"/>
+          <w:sz w:val="21"/>
+          <w:szCs w:val="21"/>
+        </w:rPr>
+        <w:t xml:space="preserve">Tasarım Defteri’nizdeki ödevlerden başlayın: her maddenin altında o maddenin hangi haftanın ödevinden geldiği yazıyor. Kısa ve net yazın.</w:t>
       </w:r>
     </w:p>
     <w:p>
@@ -102,7 +136,7 @@
           <w:sz w:val="21"/>
           <w:szCs w:val="21"/>
         </w:rPr>
-        <w:t xml:space="preserve">Oyununuza bir isim verin ve türünü seçin (platform, bulmaca, macera, yarış, strateji, diğer).</w:t>
+        <w:t xml:space="preserve">Oyununuza bir isim verin ve türünü seçin: platform, bulmaca, macera, yarış, koşu, strateji, simülasyon ya da diğer. Defterinizde: 1.2 ödevi.</w:t>
       </w:r>
     </w:p>
     <w:tbl>
@@ -198,7 +232,7 @@
           <w:sz w:val="21"/>
           <w:szCs w:val="21"/>
         </w:rPr>
-        <w:t xml:space="preserve">"Oyuncu ______ yapar." Tek cümlede oyununuzu anlatın.</w:t>
+        <w:t xml:space="preserve">“Oyuncu ______ yapar.” Tek cümlede oyununuzu anlatın. Defterinizde: 1.2 ödevi.</w:t>
       </w:r>
     </w:p>
     <w:tbl>
@@ -294,7 +328,7 @@
           <w:sz w:val="21"/>
           <w:szCs w:val="21"/>
         </w:rPr>
-        <w:t xml:space="preserve">Oyuncu oyunda neyi başarmaya çalışıyor? Kazanmak/ilerlemek için ne yapmalı?</w:t>
+        <w:t xml:space="preserve">Oyuncu oyunda neyi başarmaya çalışıyor? Kazanmak ya da ilerlemek için ne yapmalı? Defterinizde: 5.2 ödevi.</w:t>
       </w:r>
     </w:p>
     <w:tbl>
@@ -390,7 +424,7 @@
           <w:sz w:val="21"/>
           <w:szCs w:val="21"/>
         </w:rPr>
-        <w:t xml:space="preserve">Oyuncunun 2-3 temel hareketini İSİM + NASIL ÇALIŞTIĞI şeklinde yazın (örn. "Zıplama: boşluğa basınca karakter zıplar").</w:t>
+        <w:t xml:space="preserve">Oyuncunun 2-3 temel hareketini İSİM + NASIL ÇALIŞTIĞI şeklinde yazın (örn. “Zıplama: boşluğa basınca karakter zıplar”). Defterinizde: 5.1 ödevi.</w:t>
       </w:r>
     </w:p>
     <w:tbl>
@@ -494,7 +528,7 @@
           <w:sz w:val="21"/>
           <w:szCs w:val="21"/>
         </w:rPr>
-        <w:t xml:space="preserve">Her hareketin hangi tuş/dokunuşla yapıldığını yazın: Hareket, Zıplama/Etkileşim, Saldırı/Özel hareket.</w:t>
+        <w:t xml:space="preserve">Her hareketin hangi tuşla ya da dokunuşla yapıldığını yazın: Hareket, Zıplama/Etkileşim, Saldırı/Özel hareket. Defterinizde: 5.1 ödevi.</w:t>
       </w:r>
     </w:p>
     <w:tbl>
@@ -598,7 +632,7 @@
           <w:sz w:val="21"/>
           <w:szCs w:val="21"/>
         </w:rPr>
-        <w:t xml:space="preserve">Oyuncunun sürekli tekrarladığı eylemleri sırayla yazın: ___ → ___ → ___ → tekrar.</w:t>
+        <w:t xml:space="preserve">Oyuncunun sürekli tekrarladığı eylemleri sırayla yazın: ___ → ___ → ___ → tekrar. Defterinizde: 2.2 ödevi.</w:t>
       </w:r>
     </w:p>
     <w:tbl>
@@ -702,7 +736,7 @@
           <w:sz w:val="21"/>
           <w:szCs w:val="21"/>
         </w:rPr>
-        <w:t xml:space="preserve">Oyuncu nasıl kazanır, nasıl kaybeder?</w:t>
+        <w:t xml:space="preserve">Oyuncu nasıl kazanır, nasıl kaybeder? Kaybedince ne olur: baştan mı başlar, can mı gider? Defterinizde: 2.2 ödevi.</w:t>
       </w:r>
     </w:p>
     <w:tbl>
@@ -798,7 +832,7 @@
           <w:sz w:val="21"/>
           <w:szCs w:val="21"/>
         </w:rPr>
-        <w:t xml:space="preserve">Oyuncumuz kim (yaşı, sevdiği şey)? Neden bu oyunu oynasın? Oynarken hangi duyguları yaşasın?</w:t>
+        <w:t xml:space="preserve">Oyuncumuz kim (yaşı, sevdiği şey)? Neden bu oyunu oynasın? Oynarken hangi duyguları (eğlence, merak, heyecan, korku, güçlü hissetme, rekabet...) yaşasın? Defterinizde: 2.1 ödevi.</w:t>
       </w:r>
     </w:p>
     <w:tbl>
@@ -894,7 +928,7 @@
           <w:sz w:val="21"/>
           <w:szCs w:val="21"/>
         </w:rPr>
-        <w:t xml:space="preserve">2D mi 3D mü? Dünya ve karakterler nasıl görünüyor? İlham aldığınız oyun/film/çizgi film var mı?</w:t>
+        <w:t xml:space="preserve">2D mi 3D mü? Dünya ve karakterler nasıl görünüyor? Ana renkleriniz neler? İlham aldığınız oyun, film ya da çizgi film var mı? Defterinizde: 4.2 ödevi.</w:t>
       </w:r>
     </w:p>
     <w:tbl>
@@ -990,7 +1024,189 @@
           <w:sz w:val="21"/>
           <w:szCs w:val="21"/>
         </w:rPr>
-        <w:t xml:space="preserve">Oyununuzda para, puan, eşya, can veya enerji gibi bir şey var mı? Varsa nasıl kazanılıyor ve ne işe yarıyor?</w:t>
+        <w:t xml:space="preserve">Oyununuzda para, puan, eşya, can ya da enerji gibi bir şey var mı? Varsa nasıl kazanılıyor ve ne işe yarıyor? Defterinizde: 3.1 ödevi.</w:t>
+      </w:r>
+    </w:p>
+    <w:tbl>
+      <w:tblPr>
+        <w:tblW w:type="dxa" w:w="9906"/>
+        <w:tblBorders>
+          <w:top w:val="single" w:color="auto" w:sz="4"/>
+          <w:left w:val="single" w:color="auto" w:sz="4"/>
+          <w:bottom w:val="single" w:color="auto" w:sz="4"/>
+          <w:right w:val="single" w:color="auto" w:sz="4"/>
+          <w:insideH w:val="single" w:color="auto" w:sz="4"/>
+          <w:insideV w:val="single" w:color="auto" w:sz="4"/>
+        </w:tblBorders>
+      </w:tblPr>
+      <w:tblGrid>
+        <w:gridCol w:w="9906"/>
+      </w:tblGrid>
+      <w:tr>
+        <w:tc>
+          <w:tcPr>
+            <w:tcW w:type="dxa" w:w="9906"/>
+            <w:tcBorders>
+              <w:top w:val="single" w:color="999999" w:sz="4"/>
+              <w:left w:val="single" w:color="999999" w:sz="4"/>
+              <w:bottom w:val="single" w:color="999999" w:sz="4"/>
+              <w:right w:val="single" w:color="999999" w:sz="4"/>
+            </w:tcBorders>
+            <w:tcMar>
+              <w:top w:type="dxa" w:w="120"/>
+              <w:left w:type="dxa" w:w="150"/>
+              <w:bottom w:type="dxa" w:w="120"/>
+              <w:right w:type="dxa" w:w="150"/>
+            </w:tcMar>
+          </w:tcPr>
+          <w:p>
+            <w:pPr>
+              <w:spacing w:after="200"/>
+            </w:pPr>
+            <w:r>
+              <w:t xml:space="preserve"> </w:t>
+            </w:r>
+          </w:p>
+          <w:p>
+            <w:pPr>
+              <w:spacing w:after="200"/>
+            </w:pPr>
+            <w:r>
+              <w:t xml:space="preserve"> </w:t>
+            </w:r>
+          </w:p>
+          <w:p>
+            <w:pPr>
+              <w:spacing w:after="200"/>
+            </w:pPr>
+            <w:r>
+              <w:t xml:space="preserve"> </w:t>
+            </w:r>
+          </w:p>
+        </w:tc>
+      </w:tr>
+    </w:tbl>
+    <w:p>
+      <w:pPr>
+        <w:pStyle w:val="Heading2"/>
+        <w:pBdr>
+          <w:top w:val="single" w:color="17181C" w:sz="4" w:space="4"/>
+        </w:pBdr>
+        <w:spacing w:after="60" w:before="320"/>
+      </w:pPr>
+      <w:r>
+        <w:rPr>
+          <w:b/>
+          <w:bCs/>
+          <w:color w:val="17181C"/>
+        </w:rPr>
+        <w:t xml:space="preserve">Ek A: Playtest Notları (Evde)</w:t>
+      </w:r>
+    </w:p>
+    <w:p>
+      <w:pPr>
+        <w:spacing w:after="120"/>
+      </w:pPr>
+      <w:r>
+        <w:rPr>
+          <w:i/>
+          <w:iCs/>
+          <w:color w:val="6B6B6B"/>
+          <w:sz w:val="21"/>
+          <w:szCs w:val="21"/>
+        </w:rPr>
+        <w:t xml:space="preserve">Kâğıt prototipinizi evde bir aile üyenize ya da ekip dışından bir arkadaşınıza oynatın. Açıklama yapmadan izleyin: nerede duraksadı, ne zaman güldü, ne zaman sıkıldı? Buna göre neyi değiştireceksiniz?</w:t>
+      </w:r>
+    </w:p>
+    <w:tbl>
+      <w:tblPr>
+        <w:tblW w:type="dxa" w:w="9906"/>
+        <w:tblBorders>
+          <w:top w:val="single" w:color="auto" w:sz="4"/>
+          <w:left w:val="single" w:color="auto" w:sz="4"/>
+          <w:bottom w:val="single" w:color="auto" w:sz="4"/>
+          <w:right w:val="single" w:color="auto" w:sz="4"/>
+          <w:insideH w:val="single" w:color="auto" w:sz="4"/>
+          <w:insideV w:val="single" w:color="auto" w:sz="4"/>
+        </w:tblBorders>
+      </w:tblPr>
+      <w:tblGrid>
+        <w:gridCol w:w="9906"/>
+      </w:tblGrid>
+      <w:tr>
+        <w:tc>
+          <w:tcPr>
+            <w:tcW w:type="dxa" w:w="9906"/>
+            <w:tcBorders>
+              <w:top w:val="single" w:color="999999" w:sz="4"/>
+              <w:left w:val="single" w:color="999999" w:sz="4"/>
+              <w:bottom w:val="single" w:color="999999" w:sz="4"/>
+              <w:right w:val="single" w:color="999999" w:sz="4"/>
+            </w:tcBorders>
+            <w:tcMar>
+              <w:top w:type="dxa" w:w="120"/>
+              <w:left w:type="dxa" w:w="150"/>
+              <w:bottom w:type="dxa" w:w="120"/>
+              <w:right w:type="dxa" w:w="150"/>
+            </w:tcMar>
+          </w:tcPr>
+          <w:p>
+            <w:pPr>
+              <w:spacing w:after="200"/>
+            </w:pPr>
+            <w:r>
+              <w:t xml:space="preserve"> </w:t>
+            </w:r>
+          </w:p>
+          <w:p>
+            <w:pPr>
+              <w:spacing w:after="200"/>
+            </w:pPr>
+            <w:r>
+              <w:t xml:space="preserve"> </w:t>
+            </w:r>
+          </w:p>
+          <w:p>
+            <w:pPr>
+              <w:spacing w:after="200"/>
+            </w:pPr>
+            <w:r>
+              <w:t xml:space="preserve"> </w:t>
+            </w:r>
+          </w:p>
+        </w:tc>
+      </w:tr>
+    </w:tbl>
+    <w:p>
+      <w:pPr>
+        <w:pStyle w:val="Heading2"/>
+        <w:pBdr>
+          <w:top w:val="single" w:color="17181C" w:sz="4" w:space="4"/>
+        </w:pBdr>
+        <w:spacing w:after="60" w:before="320"/>
+      </w:pPr>
+      <w:r>
+        <w:rPr>
+          <w:b/>
+          <w:bCs/>
+          <w:color w:val="17181C"/>
+        </w:rPr>
+        <w:t xml:space="preserve">Ek B: 30 Saniyelik Sunum</w:t>
+      </w:r>
+    </w:p>
+    <w:p>
+      <w:pPr>
+        <w:spacing w:after="120"/>
+      </w:pPr>
+      <w:r>
+        <w:rPr>
+          <w:i/>
+          <w:iCs/>
+          <w:color w:val="6B6B6B"/>
+          <w:sz w:val="21"/>
+          <w:szCs w:val="21"/>
+        </w:rPr>
+        <w:t xml:space="preserve">Oyun adı + tek cümlelik fikir + oyuncu ne hissedecek + neden eğlenceli. Sınıfa 30 saniyede anlatacağınız metni yazın.</w:t>
       </w:r>
     </w:p>
     <w:tbl>

</xml_diff>

<commit_message>
7.1 GDD atölyesini Leke örneğiyle yeniden yaz, şablonu senkronla
Şablon yönergeleri slaytlarla birebir aynı tek kaynaktan üretildi; şablona
ders ödevlerini toplayan Ek C-F eklendi. Şablon slaytlarında örnek etiketi
artık exampleLabel alanından gelir.

Co-Authored-By: Claude Opus 5.5 <noreply@anthropic.com>
</commit_message>
<xml_diff>
--- a/GDD-Sablonu.docx
+++ b/GDD-Sablonu.docx
@@ -104,7 +104,7 @@
           <w:sz w:val="21"/>
           <w:szCs w:val="21"/>
         </w:rPr>
-        <w:t xml:space="preserve">Tasarım Defteri’nizdeki ödevlerden başlayın: her maddenin altında o maddenin hangi haftanın ödevinden geldiği yazıyor. Kısa ve net yazın.</w:t>
+        <w:t>Tasarım Defteri’nizdeki ödevlerden başlayın: her maddenin altında o maddenin hangi dersin ödevinden geldiği yazıyor. Kısa ve net yazın. Sondaki ekler (A-F), şablonda ayrı maddesi olmayan ödevleriniz içindir.</w:t>
       </w:r>
     </w:p>
     <w:p>
@@ -136,7 +136,7 @@
           <w:sz w:val="21"/>
           <w:szCs w:val="21"/>
         </w:rPr>
-        <w:t xml:space="preserve">Oyununuza bir isim verin ve türünü seçin: platform, bulmaca, macera, yarış, koşu, strateji, simülasyon ya da diğer. Defterinizde: 1.2 ödevi.</w:t>
+        <w:t>Oyununuza bir isim verin ve türünü temel fiilinize göre seçin: platform, bulmaca, aksiyon-macera, strateji, refleks, sonsuz koşu, kum havuzu ya da diğer. Defterinizde: 1.2 ödevi.</w:t>
       </w:r>
     </w:p>
     <w:tbl>
@@ -232,7 +232,7 @@
           <w:sz w:val="21"/>
           <w:szCs w:val="21"/>
         </w:rPr>
-        <w:t xml:space="preserve">“Oyuncu ______ yapar.” Tek cümlede oyununuzu anlatın. Defterinizde: 1.2 ödevi.</w:t>
+        <w:t>Yüksek konseptinizi yazın: “[Oyun], [tür] türünde bir oyundur; oyuncu [temel fiil] yaparak [hedef]e ulaşmaya çalışır. Farkı: [kanca].” Defterinizde: 1.2 ödevi.</w:t>
       </w:r>
     </w:p>
     <w:tbl>
@@ -328,7 +328,7 @@
           <w:sz w:val="21"/>
           <w:szCs w:val="21"/>
         </w:rPr>
-        <w:t xml:space="preserve">Oyuncu oyunda neyi başarmaya çalışıyor? Kazanmak ya da ilerlemek için ne yapmalı? Defterinizde: 5.2 ödevi.</w:t>
+        <w:t>Oyuncu neyi başarmaya çalışıyor, başaramazsa ne olur? Tek cümlelik amaç cümlenizi yazın; varsa yan görevlerinizi ekleyin. Defterinizde: 5.2 ödevi.</w:t>
       </w:r>
     </w:p>
     <w:tbl>
@@ -424,7 +424,7 @@
           <w:sz w:val="21"/>
           <w:szCs w:val="21"/>
         </w:rPr>
-        <w:t xml:space="preserve">Oyuncunun 2-3 temel hareketini İSİM + NASIL ÇALIŞTIĞI şeklinde yazın (örn. “Zıplama: boşluğa basınca karakter zıplar”). Defterinizde: 5.1 ödevi.</w:t>
+        <w:t>Oyuncunun 2-3 temel eylemini İSİM + NE YAPTIĞI şeklinde yazın (örn. “Zıplama: karakter yukarı sıçrar, havadayken yön değiştirebilir”). Defterinizde: 5.1 ödevi.</w:t>
       </w:r>
     </w:p>
     <w:tbl>
@@ -528,7 +528,7 @@
           <w:sz w:val="21"/>
           <w:szCs w:val="21"/>
         </w:rPr>
-        <w:t xml:space="preserve">Her hareketin hangi tuşla ya da dokunuşla yapıldığını yazın: Hareket, Zıplama/Etkileşim, Saldırı/Özel hareket. Defterinizde: 5.1 ödevi.</w:t>
+        <w:t>Her eylemin hangi tuşla, düğmeyle ya da dokunuşla yapıldığını yazın. Oyuncuların alıştığı geleneklere uyun; dokunmatik ekranda düğmeleri en az 44 nokta yapın. Defterinizde: 5.1 ödevi.</w:t>
       </w:r>
     </w:p>
     <w:tbl>
@@ -632,7 +632,7 @@
           <w:sz w:val="21"/>
           <w:szCs w:val="21"/>
         </w:rPr>
-        <w:t xml:space="preserve">Oyuncunun sürekli tekrarladığı eylemleri sırayla yazın: ___ → ___ → ___ → tekrar. Defterinizde: 2.2 ödevi.</w:t>
+        <w:t>Çekirdek döngünüzü yazın: ___ → ___ → ___ → tekrar. Bir turun ya da bölümün zorluk olarak nasıl yükselip bittiğini bir cümleyle ekleyin. Defterinizde: 2.2 ve 3.1 ödevleri.</w:t>
       </w:r>
     </w:p>
     <w:tbl>
@@ -736,7 +736,7 @@
           <w:sz w:val="21"/>
           <w:szCs w:val="21"/>
         </w:rPr>
-        <w:t xml:space="preserve">Oyuncu nasıl kazanır, nasıl kaybeder? Kaybedince ne olur: baştan mı başlar, can mı gider? Defterinizde: 2.2 ödevi.</w:t>
+        <w:t>Kazanma koşulunuzun hedef türü ne? Oyuncu nasıl kaybeder, kaybedince ne olur: anında yeniden deneme, kontrol noktası, can sistemi? Defterinizde: 2.2 ödevi.</w:t>
       </w:r>
     </w:p>
     <w:tbl>
@@ -832,7 +832,7 @@
           <w:sz w:val="21"/>
           <w:szCs w:val="21"/>
         </w:rPr>
-        <w:t xml:space="preserve">Oyuncumuz kim (yaşı, sevdiği şey)? Neden bu oyunu oynasın? Oynarken hangi duyguları (eğlence, merak, heyecan, korku, güçlü hissetme, rekabet...) yaşasın? Defterinizde: 2.1 ödevi.</w:t>
+        <w:t>Personanızı yazın: kim, ne kadar oyun oynar, ne ister, nerede ve ne kadar oynar? Deneyim hedefiniz ve birincil eğlence türünüz ne? Defterinizde: 1.2, 2.1 ve 3.1 ödevleri.</w:t>
       </w:r>
     </w:p>
     <w:tbl>
@@ -928,7 +928,7 @@
           <w:sz w:val="21"/>
           <w:szCs w:val="21"/>
         </w:rPr>
-        <w:t xml:space="preserve">2D mi 3D mü? Dünya ve karakterler nasıl görünüyor? Ana renkleriniz neler? İlham aldığınız oyun, film ya da çizgi film var mı? Defterinizde: 4.2 ödevi.</w:t>
+        <w:t>2D mi 3D mü, hangi stil? Ana karakter ve düşmanlar nasıl görünüyor (siluet, şekil dili)? 60-30-10 paletiniz ve moodboard'unuzun ortak özelliği ne? Defterinizde: 4.1 ve 4.2 ödevleri.</w:t>
       </w:r>
     </w:p>
     <w:tbl>
@@ -1024,7 +1024,7 @@
           <w:sz w:val="21"/>
           <w:szCs w:val="21"/>
         </w:rPr>
-        <w:t xml:space="preserve">Oyununuzda para, puan, eşya, can ya da enerji gibi bir şey var mı? Varsa nasıl kazanılıyor ve ne işe yarıyor? Defterinizde: 3.1 ödevi.</w:t>
+        <w:t>Oyununuzda puan, para, eşya, can ya da enerji gibi bir şey var mı? Ödülün türü ne, nasıl kazanılıyor, oyuncunun hangi motivasyonuna hitap ediyor? Defterinizde: 3.1 ödevi.</w:t>
       </w:r>
     </w:p>
     <w:tbl>
@@ -1100,7 +1100,7 @@
           <w:bCs/>
           <w:color w:val="17181C"/>
         </w:rPr>
-        <w:t xml:space="preserve">Ek A: Playtest Notları (Evde)</w:t>
+        <w:t>Ek A: Playtest Notları (Evde)</w:t>
       </w:r>
     </w:p>
     <w:p>
@@ -1115,7 +1115,7 @@
           <w:sz w:val="21"/>
           <w:szCs w:val="21"/>
         </w:rPr>
-        <w:t xml:space="preserve">Kâğıt prototipinizi evde bir aile üyenize ya da ekip dışından bir arkadaşınıza oynatın. Açıklama yapmadan izleyin: nerede duraksadı, ne zaman güldü, ne zaman sıkıldı? Buna göre neyi değiştireceksiniz?</w:t>
+        <w:t>Kâğıt prototipinizi en az üç kişiye oynatın (6.2). Kuralları anlatmayın, sesli düşünmelerini isteyin, yardım etmeyin. Her bulgu için yazın: ne oldu, kaç kişide oldu, ne karar verdiniz?</w:t>
       </w:r>
     </w:p>
     <w:tbl>
@@ -1191,7 +1191,7 @@
           <w:bCs/>
           <w:color w:val="17181C"/>
         </w:rPr>
-        <w:t xml:space="preserve">Ek B: 30 Saniyelik Sunum</w:t>
+        <w:t>Ek B: 30 Saniyelik Sunum</w:t>
       </w:r>
     </w:p>
     <w:p>
@@ -1206,7 +1206,371 @@
           <w:sz w:val="21"/>
           <w:szCs w:val="21"/>
         </w:rPr>
-        <w:t xml:space="preserve">Oyun adı + tek cümlelik fikir + oyuncu ne hissedecek + neden eğlenceli. Sınıfa 30 saniyede anlatacağınız metni yazın.</w:t>
+        <w:t>Oyun adı + yüksek konsept + oyuncu ne hissedecek + neden eğlenceli. Sınıfa 30 saniyede anlatacağınız metni yazın.</w:t>
+      </w:r>
+    </w:p>
+    <w:tbl>
+      <w:tblPr>
+        <w:tblW w:type="dxa" w:w="9906"/>
+        <w:tblBorders>
+          <w:top w:val="single" w:color="auto" w:sz="4"/>
+          <w:left w:val="single" w:color="auto" w:sz="4"/>
+          <w:bottom w:val="single" w:color="auto" w:sz="4"/>
+          <w:right w:val="single" w:color="auto" w:sz="4"/>
+          <w:insideH w:val="single" w:color="auto" w:sz="4"/>
+          <w:insideV w:val="single" w:color="auto" w:sz="4"/>
+        </w:tblBorders>
+      </w:tblPr>
+      <w:tblGrid>
+        <w:gridCol w:w="9906"/>
+      </w:tblGrid>
+      <w:tr>
+        <w:tc>
+          <w:tcPr>
+            <w:tcW w:type="dxa" w:w="9906"/>
+            <w:tcBorders>
+              <w:top w:val="single" w:color="999999" w:sz="4"/>
+              <w:left w:val="single" w:color="999999" w:sz="4"/>
+              <w:bottom w:val="single" w:color="999999" w:sz="4"/>
+              <w:right w:val="single" w:color="999999" w:sz="4"/>
+            </w:tcBorders>
+            <w:tcMar>
+              <w:top w:type="dxa" w:w="120"/>
+              <w:left w:type="dxa" w:w="150"/>
+              <w:bottom w:type="dxa" w:w="120"/>
+              <w:right w:type="dxa" w:w="150"/>
+            </w:tcMar>
+          </w:tcPr>
+          <w:p>
+            <w:pPr>
+              <w:spacing w:after="200"/>
+            </w:pPr>
+            <w:r>
+              <w:t xml:space="preserve"> </w:t>
+            </w:r>
+          </w:p>
+          <w:p>
+            <w:pPr>
+              <w:spacing w:after="200"/>
+            </w:pPr>
+            <w:r>
+              <w:t xml:space="preserve"> </w:t>
+            </w:r>
+          </w:p>
+          <w:p>
+            <w:pPr>
+              <w:spacing w:after="200"/>
+            </w:pPr>
+            <w:r>
+              <w:t xml:space="preserve"> </w:t>
+            </w:r>
+          </w:p>
+        </w:tc>
+      </w:tr>
+    </w:tbl>
+    <w:p>
+      <w:pPr>
+        <w:pStyle w:val="Heading2"/>
+        <w:pBdr>
+          <w:top w:val="single" w:color="17181C" w:sz="4" w:space="4"/>
+        </w:pBdr>
+        <w:spacing w:after="60" w:before="320"/>
+      </w:pPr>
+      <w:r>
+        <w:rPr>
+          <w:b/>
+          <w:bCs/>
+          <w:color w:val="17181C"/>
+        </w:rPr>
+        <w:t>Ek C: Bölüm Haritası</w:t>
+      </w:r>
+    </w:p>
+    <w:p>
+      <w:pPr>
+        <w:spacing w:after="120"/>
+      </w:pPr>
+      <w:r>
+        <w:rPr>
+          <w:i/>
+          <w:iCs/>
+          <w:color w:val="6B6B6B"/>
+          <w:sz w:val="21"/>
+          <w:szCs w:val="21"/>
+        </w:rPr>
+        <w:t>İlk bölümünüzün kâğıt haritası ya da tarifi: kishōtenketsu'nun dört perdesi, yoğunluk zirveleri ve nefes alanları. Defterinizde: 3.2 ödevi.</w:t>
+      </w:r>
+    </w:p>
+    <w:tbl>
+      <w:tblPr>
+        <w:tblW w:type="dxa" w:w="9906"/>
+        <w:tblBorders>
+          <w:top w:val="single" w:color="auto" w:sz="4"/>
+          <w:left w:val="single" w:color="auto" w:sz="4"/>
+          <w:bottom w:val="single" w:color="auto" w:sz="4"/>
+          <w:right w:val="single" w:color="auto" w:sz="4"/>
+          <w:insideH w:val="single" w:color="auto" w:sz="4"/>
+          <w:insideV w:val="single" w:color="auto" w:sz="4"/>
+        </w:tblBorders>
+      </w:tblPr>
+      <w:tblGrid>
+        <w:gridCol w:w="9906"/>
+      </w:tblGrid>
+      <w:tr>
+        <w:tc>
+          <w:tcPr>
+            <w:tcW w:type="dxa" w:w="9906"/>
+            <w:tcBorders>
+              <w:top w:val="single" w:color="999999" w:sz="4"/>
+              <w:left w:val="single" w:color="999999" w:sz="4"/>
+              <w:bottom w:val="single" w:color="999999" w:sz="4"/>
+              <w:right w:val="single" w:color="999999" w:sz="4"/>
+            </w:tcBorders>
+            <w:tcMar>
+              <w:top w:type="dxa" w:w="120"/>
+              <w:left w:type="dxa" w:w="150"/>
+              <w:bottom w:type="dxa" w:w="120"/>
+              <w:right w:type="dxa" w:w="150"/>
+            </w:tcMar>
+          </w:tcPr>
+          <w:p>
+            <w:pPr>
+              <w:spacing w:after="200"/>
+            </w:pPr>
+            <w:r>
+              <w:t xml:space="preserve"> </w:t>
+            </w:r>
+          </w:p>
+          <w:p>
+            <w:pPr>
+              <w:spacing w:after="200"/>
+            </w:pPr>
+            <w:r>
+              <w:t xml:space="preserve"> </w:t>
+            </w:r>
+          </w:p>
+          <w:p>
+            <w:pPr>
+              <w:spacing w:after="200"/>
+            </w:pPr>
+            <w:r>
+              <w:t xml:space="preserve"> </w:t>
+            </w:r>
+          </w:p>
+        </w:tc>
+      </w:tr>
+    </w:tbl>
+    <w:p>
+      <w:pPr>
+        <w:pStyle w:val="Heading2"/>
+        <w:pBdr>
+          <w:top w:val="single" w:color="17181C" w:sz="4" w:space="4"/>
+        </w:pBdr>
+        <w:spacing w:after="60" w:before="320"/>
+      </w:pPr>
+      <w:r>
+        <w:rPr>
+          <w:b/>
+          <w:bCs/>
+          <w:color w:val="17181C"/>
+        </w:rPr>
+        <w:t>Ek D: Düşmanlar ve Engeller</w:t>
+      </w:r>
+    </w:p>
+    <w:p>
+      <w:pPr>
+        <w:spacing w:after="120"/>
+      </w:pPr>
+      <w:r>
+        <w:rPr>
+          <w:i/>
+          <w:iCs/>
+          <w:color w:val="6B6B6B"/>
+          <w:sz w:val="21"/>
+          <w:szCs w:val="21"/>
+        </w:rPr>
+        <w:t>En fazla üç düşman ya da engel: davranışı, telgrafı ve oyuncunun fiiline sorduğu soru. Defterinizde: 4.1 ödevi.</w:t>
+      </w:r>
+    </w:p>
+    <w:tbl>
+      <w:tblPr>
+        <w:tblW w:type="dxa" w:w="9906"/>
+        <w:tblBorders>
+          <w:top w:val="single" w:color="auto" w:sz="4"/>
+          <w:left w:val="single" w:color="auto" w:sz="4"/>
+          <w:bottom w:val="single" w:color="auto" w:sz="4"/>
+          <w:right w:val="single" w:color="auto" w:sz="4"/>
+          <w:insideH w:val="single" w:color="auto" w:sz="4"/>
+          <w:insideV w:val="single" w:color="auto" w:sz="4"/>
+        </w:tblBorders>
+      </w:tblPr>
+      <w:tblGrid>
+        <w:gridCol w:w="9906"/>
+      </w:tblGrid>
+      <w:tr>
+        <w:tc>
+          <w:tcPr>
+            <w:tcW w:type="dxa" w:w="9906"/>
+            <w:tcBorders>
+              <w:top w:val="single" w:color="999999" w:sz="4"/>
+              <w:left w:val="single" w:color="999999" w:sz="4"/>
+              <w:bottom w:val="single" w:color="999999" w:sz="4"/>
+              <w:right w:val="single" w:color="999999" w:sz="4"/>
+            </w:tcBorders>
+            <w:tcMar>
+              <w:top w:type="dxa" w:w="120"/>
+              <w:left w:type="dxa" w:w="150"/>
+              <w:bottom w:type="dxa" w:w="120"/>
+              <w:right w:type="dxa" w:w="150"/>
+            </w:tcMar>
+          </w:tcPr>
+          <w:p>
+            <w:pPr>
+              <w:spacing w:after="200"/>
+            </w:pPr>
+            <w:r>
+              <w:t xml:space="preserve"> </w:t>
+            </w:r>
+          </w:p>
+          <w:p>
+            <w:pPr>
+              <w:spacing w:after="200"/>
+            </w:pPr>
+            <w:r>
+              <w:t xml:space="preserve"> </w:t>
+            </w:r>
+          </w:p>
+          <w:p>
+            <w:pPr>
+              <w:spacing w:after="200"/>
+            </w:pPr>
+            <w:r>
+              <w:t xml:space="preserve"> </w:t>
+            </w:r>
+          </w:p>
+        </w:tc>
+      </w:tr>
+    </w:tbl>
+    <w:p>
+      <w:pPr>
+        <w:pStyle w:val="Heading2"/>
+        <w:pBdr>
+          <w:top w:val="single" w:color="17181C" w:sz="4" w:space="4"/>
+        </w:pBdr>
+        <w:spacing w:after="60" w:before="320"/>
+      </w:pPr>
+      <w:r>
+        <w:rPr>
+          <w:b/>
+          <w:bCs/>
+          <w:color w:val="17181C"/>
+        </w:rPr>
+        <w:t>Ek E: Hikâye Omurgası</w:t>
+      </w:r>
+    </w:p>
+    <w:p>
+      <w:pPr>
+        <w:spacing w:after="120"/>
+      </w:pPr>
+      <w:r>
+        <w:rPr>
+          <w:i/>
+          <w:iCs/>
+          <w:color w:val="6B6B6B"/>
+          <w:sz w:val="21"/>
+          <w:szCs w:val="21"/>
+        </w:rPr>
+        <w:t>Bir zamanlar… Her gün… Ama bir gün… Bu yüzden… Sonunda… Her cümlenin oyunda neye karşılık geldiğini yanına yazın. Defterinizde: 5.2 ödevi.</w:t>
+      </w:r>
+    </w:p>
+    <w:tbl>
+      <w:tblPr>
+        <w:tblW w:type="dxa" w:w="9906"/>
+        <w:tblBorders>
+          <w:top w:val="single" w:color="auto" w:sz="4"/>
+          <w:left w:val="single" w:color="auto" w:sz="4"/>
+          <w:bottom w:val="single" w:color="auto" w:sz="4"/>
+          <w:right w:val="single" w:color="auto" w:sz="4"/>
+          <w:insideH w:val="single" w:color="auto" w:sz="4"/>
+          <w:insideV w:val="single" w:color="auto" w:sz="4"/>
+        </w:tblBorders>
+      </w:tblPr>
+      <w:tblGrid>
+        <w:gridCol w:w="9906"/>
+      </w:tblGrid>
+      <w:tr>
+        <w:tc>
+          <w:tcPr>
+            <w:tcW w:type="dxa" w:w="9906"/>
+            <w:tcBorders>
+              <w:top w:val="single" w:color="999999" w:sz="4"/>
+              <w:left w:val="single" w:color="999999" w:sz="4"/>
+              <w:bottom w:val="single" w:color="999999" w:sz="4"/>
+              <w:right w:val="single" w:color="999999" w:sz="4"/>
+            </w:tcBorders>
+            <w:tcMar>
+              <w:top w:type="dxa" w:w="120"/>
+              <w:left w:type="dxa" w:w="150"/>
+              <w:bottom w:type="dxa" w:w="120"/>
+              <w:right w:type="dxa" w:w="150"/>
+            </w:tcMar>
+          </w:tcPr>
+          <w:p>
+            <w:pPr>
+              <w:spacing w:after="200"/>
+            </w:pPr>
+            <w:r>
+              <w:t xml:space="preserve"> </w:t>
+            </w:r>
+          </w:p>
+          <w:p>
+            <w:pPr>
+              <w:spacing w:after="200"/>
+            </w:pPr>
+            <w:r>
+              <w:t xml:space="preserve"> </w:t>
+            </w:r>
+          </w:p>
+          <w:p>
+            <w:pPr>
+              <w:spacing w:after="200"/>
+            </w:pPr>
+            <w:r>
+              <w:t xml:space="preserve"> </w:t>
+            </w:r>
+          </w:p>
+        </w:tc>
+      </w:tr>
+    </w:tbl>
+    <w:p>
+      <w:pPr>
+        <w:pStyle w:val="Heading2"/>
+        <w:pBdr>
+          <w:top w:val="single" w:color="17181C" w:sz="4" w:space="4"/>
+        </w:pBdr>
+        <w:spacing w:after="60" w:before="320"/>
+      </w:pPr>
+      <w:r>
+        <w:rPr>
+          <w:b/>
+          <w:bCs/>
+          <w:color w:val="17181C"/>
+        </w:rPr>
+        <w:t>Ek F: Değişiklik Kaydı</w:t>
+      </w:r>
+    </w:p>
+    <w:p>
+      <w:pPr>
+        <w:spacing w:after="120"/>
+      </w:pPr>
+      <w:r>
+        <w:rPr>
+          <w:i/>
+          <w:iCs/>
+          <w:color w:val="6B6B6B"/>
+          <w:sz w:val="21"/>
+          <w:szCs w:val="21"/>
+        </w:rPr>
+        <w:t>Fikriniz hangi derste ya da hangi testten sonra nasıl değişti ve neden? Defterinizde: 6.1 ve 6.2 ödevleri.</w:t>
       </w:r>
     </w:p>
     <w:tbl>

</xml_diff>